<commit_message>
fix: corregir referencias de 'cuatro días' a 'cinco días' en Bienvenida, L3 y L4
El PDF fuente define un reto de 5 días + 4 videolecciones como componentes
separados. Los guiones referenciaban incorrectamente 4 días.

Cambios:
- Bienvenida: 'reto de cuatro días' → 'cinco días', añadido párrafo del Día 5
- L3: 'cerrar este reto' → 'última lección', referencia al quinto día
- L4: 'al cierre' → 'última lección', añadida mención explícita del Día 5

Co-Authored-By: Claude Opus 4.6 <noreply@anthropic.com>
Claude-Session: https://claude.ai/code/session_01Ckn4tWPBBtcwfWfjCFoEeh
</commit_message>
<xml_diff>
--- a/Bienvenida_Baja_Revoluciones.docx
+++ b/Bienvenida_Baja_Revoluciones.docx
@@ -46,7 +46,7 @@
           <w:color w:val="646464"/>
           <w:sz w:val="20"/>
         </w:rPr>
-        <w:t>496</w:t>
+        <w:t>532</w:t>
       </w:r>
       <w:r>
         <w:rPr>
@@ -61,7 +61,7 @@
           <w:color w:val="646464"/>
           <w:sz w:val="20"/>
         </w:rPr>
-        <w:t>07-09-2026</w:t>
+        <w:t>08-09-2026</w:t>
       </w:r>
     </w:p>
     <w:p>
@@ -144,7 +144,7 @@
           <w:color w:val="282828"/>
           <w:sz w:val="24"/>
         </w:rPr>
-        <w:t>Baja Revoluciones es un reto de cuatro días donde vas a aprender a observar cómo funciona tu día, identificar qué variables están afectando tu energía y tu capacidad de recuperar, y usar una herramienta concreta para darle a tu cuerpo las señales de pausa que necesita. Al final, vas a tener un sistema personal diseñado por ti, para ti.</w:t>
+        <w:t>Baja Revoluciones es un reto de cinco días donde vas a aprender a observar cómo funciona tu día, identificar qué variables están afectando tu energía y tu capacidad de recuperar, y usar una herramienta concreta para darle a tu cuerpo las señales de pausa que necesita. Al final, vas a tener un sistema personal diseñado por ti, para ti.</w:t>
       </w:r>
     </w:p>
     <w:p>
@@ -257,6 +257,20 @@
           <w:sz w:val="24"/>
         </w:rPr>
         <w:t>Lección 4: De una herramienta a un sistema personal. Tomas todo lo anterior y lo conviertes en algo sostenible que funciona más allá de este reto.</w:t>
+      </w:r>
+    </w:p>
+    <w:p>
+      <w:pPr>
+        <w:spacing w:after="200" w:line="360" w:lineRule="auto"/>
+        <w:jc w:val="both"/>
+      </w:pPr>
+      <w:r>
+        <w:rPr>
+          <w:rFonts w:ascii="Calibri" w:hAnsi="Calibri"/>
+          <w:color w:val="282828"/>
+          <w:sz w:val="24"/>
+        </w:rPr>
+        <w:t>Y el quinto día es tuyo. Sin lección nueva. Ese día revisas todo lo que hiciste, decides qué se queda en tu rutina y qué ajustas. Es el día donde el mapa se convierte en brújula.</w:t>
       </w:r>
     </w:p>
     <w:p>

</xml_diff>